<commit_message>
Streamline defense presentation to 8 slides, remove redundant slides 3/5/6/7/8, and detail Prototyping SDLC phases
</commit_message>
<xml_diff>
--- a/Professional_Project_Defense_Presentation_AuraQA.docx
+++ b/Professional_Project_Defense_Presentation_AuraQA.docx
@@ -9,7 +9,7 @@
           <w:color w:val="1F4E78"/>
           <w:sz w:val="32"/>
         </w:rPr>
-        <w:t>PROFESSIONAL PROJECT DEFENSE PRESENTATION</w:t>
+        <w:t>PROFESSIONAL PROJECT DEFENSE PRESENTATION (STREAMLINED DECK)</w:t>
         <w:br/>
       </w:r>
       <w:r>
@@ -222,85 +222,7 @@
           <w:color w:val="1F4E78"/>
           <w:sz w:val="26"/>
         </w:rPr>
-        <w:t>Slide 3: Background of the Study &amp; Problem Statement</w:t>
-      </w:r>
-    </w:p>
-    <w:p>
-      <w:pPr>
-        <w:pStyle w:val="ListBullet"/>
-        <w:spacing w:before="0" w:after="60"/>
-        <w:ind w:left="432"/>
-      </w:pPr>
-      <w:r>
-        <w:rPr>
-          <w:b/>
-        </w:rPr>
-        <w:t xml:space="preserve">Manual Inefficiency: </w:t>
-      </w:r>
-      <w:r>
-        <w:t>Manual reading and keyword searching across extensive PDF/DOCX documents lead to information oversight.</w:t>
-      </w:r>
-    </w:p>
-    <w:p>
-      <w:pPr>
-        <w:pStyle w:val="ListBullet"/>
-        <w:spacing w:before="0" w:after="60"/>
-        <w:ind w:left="432"/>
-      </w:pPr>
-      <w:r>
-        <w:rPr>
-          <w:b/>
-        </w:rPr>
-        <w:t xml:space="preserve">Cloud Data Sovereignty: </w:t>
-      </w:r>
-      <w:r>
-        <w:t>Sending private research or institutional data to external cloud APIs violates data sovereignty and incurs usage fees.</w:t>
-      </w:r>
-    </w:p>
-    <w:p>
-      <w:pPr>
-        <w:pStyle w:val="ListBullet"/>
-        <w:spacing w:before="0" w:after="60"/>
-        <w:ind w:left="432"/>
-      </w:pPr>
-      <w:r>
-        <w:rPr>
-          <w:b/>
-        </w:rPr>
-        <w:t xml:space="preserve">CPU Latency Bottleneck: </w:t>
-      </w:r>
-      <w:r>
-        <w:t>Running local LLMs directly on standard CPU hardware suffers from high prefill latency during context processing.</w:t>
-      </w:r>
-    </w:p>
-    <w:p>
-      <w:pPr>
-        <w:pStyle w:val="ListBullet"/>
-        <w:spacing w:before="0" w:after="60"/>
-        <w:ind w:left="432"/>
-      </w:pPr>
-      <w:r>
-        <w:rPr>
-          <w:b/>
-        </w:rPr>
-        <w:t xml:space="preserve">Integrated Learning Support: </w:t>
-      </w:r>
-      <w:r>
-        <w:t>Existing tools lack a single platform combining document QA with Study Mode features.</w:t>
-      </w:r>
-    </w:p>
-    <w:p>
-      <w:pPr>
-        <w:keepNext/>
-        <w:spacing w:before="280" w:after="80"/>
-      </w:pPr>
-      <w:r>
-        <w:rPr>
-          <w:b/>
-          <w:color w:val="1F4E78"/>
-          <w:sz w:val="26"/>
-        </w:rPr>
-        <w:t>Slide 4: Aim and Objectives of the System</w:t>
+        <w:t>Slide 3: Aim and Objectives of the System</w:t>
       </w:r>
     </w:p>
     <w:p>
@@ -394,7 +316,7 @@
           <w:color w:val="1F4E78"/>
           <w:sz w:val="26"/>
         </w:rPr>
-        <w:t>Slide 5: SDLC Methodology &amp; Why Prototyping Was Chosen</w:t>
+        <w:t>Slide 4: System Development Life Cycle (SDLC) &amp; Methodology</w:t>
       </w:r>
     </w:p>
     <w:p>
@@ -407,10 +329,10 @@
         <w:rPr>
           <w:b/>
         </w:rPr>
-        <w:t xml:space="preserve">Methodology: </w:t>
+        <w:t xml:space="preserve">What is the Methodology? </w:t>
       </w:r>
       <w:r>
-        <w:t>Prototyping Software Development Life Cycle (SDLC) was selected over traditional Waterfall.</w:t>
+        <w:t>Prototyping SDLC — an iterative 4-phase software engineering model chosen over rigid Waterfall for continuous experimental refinement.</w:t>
       </w:r>
     </w:p>
     <w:p>
@@ -423,10 +345,10 @@
         <w:rPr>
           <w:b/>
         </w:rPr>
-        <w:t xml:space="preserve">Reason 1 (Iterative Chunking): </w:t>
+        <w:t xml:space="preserve">Phase 1 - Requirements &amp; Analysis: </w:t>
       </w:r>
       <w:r>
-        <w:t>Allowed benchmarking different segment sizes to discover the optimal 1000-char chunking with 150-char overlap.</w:t>
+        <w:t>Defined offline data privacy requirements, multi-format ingestion needs (PDF, DOCX, CSV), and local CPU hardware latency constraints.</w:t>
       </w:r>
     </w:p>
     <w:p>
@@ -439,10 +361,10 @@
         <w:rPr>
           <w:b/>
         </w:rPr>
-        <w:t xml:space="preserve">Reason 2 (UI Refinement): </w:t>
+        <w:t xml:space="preserve">Phase 2 - Quick Prototype Design: </w:t>
       </w:r>
       <w:r>
-        <w:t>Rapidly testing and refining the collapsible sidebar, floating overlay, and Study Mode dashboards with direct user feedback.</w:t>
+        <w:t>Built initial Next.js single-page UI, FastAPI backend services, SQLite database schemas, and FAISS vector indexing.</w:t>
       </w:r>
     </w:p>
     <w:p>
@@ -455,10 +377,26 @@
         <w:rPr>
           <w:b/>
         </w:rPr>
-        <w:t xml:space="preserve">Reason 3 (Latency Optimization): </w:t>
+        <w:t xml:space="preserve">Phase 3 - Iterative Refinement &amp; Benchmarking: </w:t>
       </w:r>
       <w:r>
-        <w:t>Enabled benchmark-driven iterations that introduced the 0.00s deterministic query classifier and out-of-scope grounding shield.</w:t>
+        <w:t>Iteratively benchmarked chunk sizes (finding 1000 chars + 150 overlap optimal) and created the 0.00s deterministic query classifier.</w:t>
+      </w:r>
+    </w:p>
+    <w:p>
+      <w:pPr>
+        <w:pStyle w:val="ListBullet"/>
+        <w:spacing w:before="0" w:after="60"/>
+        <w:ind w:left="432"/>
+      </w:pPr>
+      <w:r>
+        <w:rPr>
+          <w:b/>
+        </w:rPr>
+        <w:t xml:space="preserve">Phase 4 - Final System Evaluation &amp; Testing: </w:t>
+      </w:r>
+      <w:r>
+        <w:t>Validated out-of-scope grounding shield accuracy (threshold 0.40), Hausa query detection, and full offline execution.</w:t>
       </w:r>
     </w:p>
     <w:p>
@@ -472,289 +410,7 @@
           <w:color w:val="1F4E78"/>
           <w:sz w:val="26"/>
         </w:rPr>
-        <w:t>Slide 6: System Architecture and Data Flow</w:t>
-      </w:r>
-    </w:p>
-    <w:p>
-      <w:pPr>
-        <w:pStyle w:val="ListBullet"/>
-        <w:spacing w:before="0" w:after="60"/>
-        <w:ind w:left="432"/>
-      </w:pPr>
-      <w:r>
-        <w:rPr>
-          <w:b/>
-        </w:rPr>
-        <w:t xml:space="preserve">User Interaction: </w:t>
-      </w:r>
-      <w:r>
-        <w:t>Next.js 16 responsive SPA interface communicating with backend services via REST APIs.</w:t>
-      </w:r>
-    </w:p>
-    <w:p>
-      <w:pPr>
-        <w:pStyle w:val="ListBullet"/>
-        <w:spacing w:before="0" w:after="60"/>
-        <w:ind w:left="432"/>
-      </w:pPr>
-      <w:r>
-        <w:rPr>
-          <w:b/>
-        </w:rPr>
-        <w:t xml:space="preserve">Ingestion Layer: </w:t>
-      </w:r>
-      <w:r>
-        <w:t>Multi-format text extraction (pdf, docx, csv, txt) split into overlapping semantic segments.</w:t>
-      </w:r>
-    </w:p>
-    <w:p>
-      <w:pPr>
-        <w:pStyle w:val="ListBullet"/>
-        <w:spacing w:before="0" w:after="60"/>
-        <w:ind w:left="432"/>
-      </w:pPr>
-      <w:r>
-        <w:rPr>
-          <w:b/>
-        </w:rPr>
-        <w:t xml:space="preserve">Dense Vector Indexing: </w:t>
-      </w:r>
-      <w:r>
-        <w:t>paraphrase-multilingual-MiniLM-L12-v2 model maps text chunks into FAISS FlatIP index.</w:t>
-      </w:r>
-    </w:p>
-    <w:p>
-      <w:pPr>
-        <w:pStyle w:val="ListBullet"/>
-        <w:spacing w:before="0" w:after="60"/>
-        <w:ind w:left="432"/>
-      </w:pPr>
-      <w:r>
-        <w:rPr>
-          <w:b/>
-        </w:rPr>
-        <w:t xml:space="preserve">Intent &amp; Search Engine: </w:t>
-      </w:r>
-      <w:r>
-        <w:t>Deterministic rule-based query classifier routes requests in 0.00s and retrieves top matching vectors.</w:t>
-      </w:r>
-    </w:p>
-    <w:p>
-      <w:pPr>
-        <w:pStyle w:val="ListBullet"/>
-        <w:spacing w:before="0" w:after="60"/>
-        <w:ind w:left="432"/>
-      </w:pPr>
-      <w:r>
-        <w:rPr>
-          <w:b/>
-        </w:rPr>
-        <w:t xml:space="preserve">Local LLM Generation: </w:t>
-      </w:r>
-      <w:r>
-        <w:t>Ollama engine executes Qwen 2.5 / Gemma 2 locally to stream grounded answers.</w:t>
-      </w:r>
-    </w:p>
-    <w:p>
-      <w:pPr>
-        <w:keepNext/>
-        <w:spacing w:before="280" w:after="80"/>
-      </w:pPr>
-      <w:r>
-        <w:rPr>
-          <w:b/>
-          <w:color w:val="1F4E78"/>
-          <w:sz w:val="26"/>
-        </w:rPr>
-        <w:t>Slide 7: Technologies Used</w:t>
-      </w:r>
-    </w:p>
-    <w:p>
-      <w:pPr>
-        <w:pStyle w:val="ListBullet"/>
-        <w:spacing w:before="0" w:after="60"/>
-        <w:ind w:left="432"/>
-      </w:pPr>
-      <w:r>
-        <w:rPr>
-          <w:b/>
-        </w:rPr>
-        <w:t xml:space="preserve">Frontend: </w:t>
-      </w:r>
-      <w:r>
-        <w:t>Next.js 16 (React 19) + Tailwind CSS + Lucide Icons.</w:t>
-      </w:r>
-    </w:p>
-    <w:p>
-      <w:pPr>
-        <w:pStyle w:val="ListBullet"/>
-        <w:spacing w:before="0" w:after="60"/>
-        <w:ind w:left="432"/>
-      </w:pPr>
-      <w:r>
-        <w:rPr>
-          <w:b/>
-        </w:rPr>
-        <w:t xml:space="preserve">Backend: </w:t>
-      </w:r>
-      <w:r>
-        <w:t>FastAPI (Python 3.10+) + Uvicorn ASGI Server.</w:t>
-      </w:r>
-    </w:p>
-    <w:p>
-      <w:pPr>
-        <w:pStyle w:val="ListBullet"/>
-        <w:spacing w:before="0" w:after="60"/>
-        <w:ind w:left="432"/>
-      </w:pPr>
-      <w:r>
-        <w:rPr>
-          <w:b/>
-        </w:rPr>
-        <w:t xml:space="preserve">Database: </w:t>
-      </w:r>
-      <w:r>
-        <w:t>SQLite (SQLAlchemy ORM for Users, Chats, Documents, Quizzes, Flashcards).</w:t>
-      </w:r>
-    </w:p>
-    <w:p>
-      <w:pPr>
-        <w:pStyle w:val="ListBullet"/>
-        <w:spacing w:before="0" w:after="60"/>
-        <w:ind w:left="432"/>
-      </w:pPr>
-      <w:r>
-        <w:rPr>
-          <w:b/>
-        </w:rPr>
-        <w:t xml:space="preserve">Vector Store: </w:t>
-      </w:r>
-      <w:r>
-        <w:t>FAISS (Facebook AI Similarity Search) with IndexIDMap and Inner Product quantizer.</w:t>
-      </w:r>
-    </w:p>
-    <w:p>
-      <w:pPr>
-        <w:pStyle w:val="ListBullet"/>
-        <w:spacing w:before="0" w:after="60"/>
-        <w:ind w:left="432"/>
-      </w:pPr>
-      <w:r>
-        <w:rPr>
-          <w:b/>
-        </w:rPr>
-        <w:t xml:space="preserve">AI Embeddings &amp; LLM: </w:t>
-      </w:r>
-      <w:r>
-        <w:t>Sentence Transformers + Ollama Local LLM Runner (Qwen 2.5 / Gemma 2).</w:t>
-      </w:r>
-    </w:p>
-    <w:p>
-      <w:pPr>
-        <w:keepNext/>
-        <w:spacing w:before="280" w:after="80"/>
-      </w:pPr>
-      <w:r>
-        <w:rPr>
-          <w:b/>
-          <w:color w:val="1F4E78"/>
-          <w:sz w:val="26"/>
-        </w:rPr>
-        <w:t>Slide 8: System Demonstration &amp; Core Modules</w:t>
-      </w:r>
-    </w:p>
-    <w:p>
-      <w:pPr>
-        <w:pStyle w:val="ListBullet"/>
-        <w:spacing w:before="0" w:after="60"/>
-        <w:ind w:left="432"/>
-      </w:pPr>
-      <w:r>
-        <w:rPr>
-          <w:b/>
-        </w:rPr>
-        <w:t xml:space="preserve">Authentication: </w:t>
-      </w:r>
-      <w:r>
-        <w:t>Secure JWT token authentication with bcrypt password hashing.</w:t>
-      </w:r>
-    </w:p>
-    <w:p>
-      <w:pPr>
-        <w:pStyle w:val="ListBullet"/>
-        <w:spacing w:before="0" w:after="60"/>
-        <w:ind w:left="432"/>
-      </w:pPr>
-      <w:r>
-        <w:rPr>
-          <w:b/>
-        </w:rPr>
-        <w:t xml:space="preserve">Document Upload: </w:t>
-      </w:r>
-      <w:r>
-        <w:t>Drag-and-drop file ingestion with automatic language detection.</w:t>
-      </w:r>
-    </w:p>
-    <w:p>
-      <w:pPr>
-        <w:pStyle w:val="ListBullet"/>
-        <w:spacing w:before="0" w:after="60"/>
-        <w:ind w:left="432"/>
-      </w:pPr>
-      <w:r>
-        <w:rPr>
-          <w:b/>
-        </w:rPr>
-        <w:t xml:space="preserve">Chat Interface: </w:t>
-      </w:r>
-      <w:r>
-        <w:t>Collapsible Gemini-style sidebar, floating overlay input, and streaming response viewport.</w:t>
-      </w:r>
-    </w:p>
-    <w:p>
-      <w:pPr>
-        <w:pStyle w:val="ListBullet"/>
-        <w:spacing w:before="0" w:after="60"/>
-        <w:ind w:left="432"/>
-      </w:pPr>
-      <w:r>
-        <w:rPr>
-          <w:b/>
-        </w:rPr>
-        <w:t xml:space="preserve">Study Mode Tools: </w:t>
-      </w:r>
-      <w:r>
-        <w:t>Instant automated summary extraction, multiple-choice quiz generator, and interactive flashcards.</w:t>
-      </w:r>
-    </w:p>
-    <w:p>
-      <w:pPr>
-        <w:pStyle w:val="ListBullet"/>
-        <w:spacing w:before="0" w:after="60"/>
-        <w:ind w:left="432"/>
-      </w:pPr>
-      <w:r>
-        <w:rPr>
-          <w:b/>
-        </w:rPr>
-        <w:t xml:space="preserve">Hausa Support: </w:t>
-      </w:r>
-      <w:r>
-        <w:t>Native Hausa query detection (`ha`) with Hausa out-of-scope warning prefixes.</w:t>
-      </w:r>
-    </w:p>
-    <w:p>
-      <w:pPr>
-        <w:keepNext/>
-        <w:spacing w:before="280" w:after="80"/>
-      </w:pPr>
-      <w:r>
-        <w:rPr>
-          <w:b/>
-          <w:color w:val="1F4E78"/>
-          <w:sz w:val="26"/>
-        </w:rPr>
-        <w:t>Slide 9: Testing and Benchmark Results</w:t>
+        <w:t>Slide 5: Testing and Benchmark Results</w:t>
       </w:r>
     </w:p>
     <w:p>
@@ -832,7 +488,7 @@
           <w:color w:val="1F4E78"/>
           <w:sz w:val="26"/>
         </w:rPr>
-        <w:t>Slide 10: Conclusion and Contributions</w:t>
+        <w:t>Slide 6: Conclusion and Contributions</w:t>
       </w:r>
     </w:p>
     <w:p>
@@ -910,7 +566,7 @@
           <w:color w:val="1F4E78"/>
           <w:sz w:val="26"/>
         </w:rPr>
-        <w:t>Slide 11: Key References</w:t>
+        <w:t>Slide 7: Key References</w:t>
       </w:r>
     </w:p>
     <w:p>
@@ -988,7 +644,7 @@
           <w:color w:val="1F4E78"/>
           <w:sz w:val="26"/>
         </w:rPr>
-        <w:t>Slide 12: Recommendations &amp; Future Work</w:t>
+        <w:t>Slide 8: Recommendations &amp; Future Work</w:t>
       </w:r>
     </w:p>
     <w:p>

</xml_diff>

<commit_message>
Update Professional Project Defense Presentation (7 Slides structure)
</commit_message>
<xml_diff>
--- a/Professional_Project_Defense_Presentation_AuraQA.docx
+++ b/Professional_Project_Defense_Presentation_AuraQA.docx
@@ -9,7 +9,7 @@
           <w:color w:val="1F4E78"/>
           <w:sz w:val="32"/>
         </w:rPr>
-        <w:t>PROFESSIONAL PROJECT DEFENSE PRESENTATION (STREAMLINED DECK)</w:t>
+        <w:t>PROFESSIONAL PROJECT DEFENSE PRESENTATION (7 SLIDES)</w:t>
         <w:br/>
       </w:r>
       <w:r>
@@ -128,7 +128,7 @@
           <w:color w:val="1F4E78"/>
           <w:sz w:val="26"/>
         </w:rPr>
-        <w:t>Slide 2: Short Abstract</w:t>
+        <w:t>Slide 2: Introduction (Abstract, Problem, Aim &amp; Objectives)</w:t>
       </w:r>
     </w:p>
     <w:p>
@@ -141,10 +141,10 @@
         <w:rPr>
           <w:b/>
         </w:rPr>
-        <w:t xml:space="preserve">Problem Context: </w:t>
+        <w:t xml:space="preserve">Short Abstract: </w:t>
       </w:r>
       <w:r>
-        <w:t>Cloud-based LLMs present severe data privacy risks and high operational API costs when processing private academic documents.</w:t>
+        <w:t>AuraQA is a fully offline RAG system that eliminates cloud data privacy risks and API costs while optimizing CPU prefill latency.</w:t>
       </w:r>
     </w:p>
     <w:p>
@@ -157,10 +157,10 @@
         <w:rPr>
           <w:b/>
         </w:rPr>
-        <w:t xml:space="preserve">Proposed Solution: </w:t>
+        <w:t xml:space="preserve">Problem Statement: </w:t>
       </w:r>
       <w:r>
-        <w:t>AuraQA introduces a fully offline Retrieval-Augmented Generation (RAG) system utilizing FAISS dense vector search and local LLMs.</w:t>
+        <w:t>Manual document reading is inefficient, keyword search lacks context, and cloud LLMs expose sensitive data to privacy risks.</w:t>
       </w:r>
     </w:p>
     <w:p>
@@ -173,69 +173,7 @@
         <w:rPr>
           <w:b/>
         </w:rPr>
-        <w:t xml:space="preserve">Key Methodology: </w:t>
-      </w:r>
-      <w:r>
-        <w:t>Employs Prototyping SDLC, aligned 1000-char text chunking, and a deterministic rule-based query classifier (0.00s latency).</w:t>
-      </w:r>
-    </w:p>
-    <w:p>
-      <w:pPr>
-        <w:pStyle w:val="ListBullet"/>
-        <w:spacing w:before="0" w:after="60"/>
-        <w:ind w:left="432"/>
-      </w:pPr>
-      <w:r>
-        <w:rPr>
-          <w:b/>
-        </w:rPr>
-        <w:t xml:space="preserve">Empirical Results: </w:t>
-      </w:r>
-      <w:r>
-        <w:t>Overall RAG CPU latency reduced by 48.57% (71.69s to 36.87s) with a 0.40 similarity threshold out-of-scope grounding shield.</w:t>
-      </w:r>
-    </w:p>
-    <w:p>
-      <w:pPr>
-        <w:pStyle w:val="ListBullet"/>
-        <w:spacing w:before="0" w:after="60"/>
-        <w:ind w:left="432"/>
-      </w:pPr>
-      <w:r>
-        <w:rPr>
-          <w:b/>
-        </w:rPr>
-        <w:t xml:space="preserve">Multilingual Support: </w:t>
-      </w:r>
-      <w:r>
-        <w:t>Native support for Hausa, Arabic, French, Spanish, German, and English query handling.</w:t>
-      </w:r>
-    </w:p>
-    <w:p>
-      <w:pPr>
-        <w:keepNext/>
-        <w:spacing w:before="280" w:after="80"/>
-      </w:pPr>
-      <w:r>
-        <w:rPr>
-          <w:b/>
-          <w:color w:val="1F4E78"/>
-          <w:sz w:val="26"/>
-        </w:rPr>
-        <w:t>Slide 3: Aim and Objectives of the System</w:t>
-      </w:r>
-    </w:p>
-    <w:p>
-      <w:pPr>
-        <w:pStyle w:val="ListBullet"/>
-        <w:spacing w:before="0" w:after="60"/>
-        <w:ind w:left="432"/>
-      </w:pPr>
-      <w:r>
-        <w:rPr>
-          <w:b/>
-        </w:rPr>
-        <w:t xml:space="preserve">Overall Aim: </w:t>
+        <w:t xml:space="preserve">Aim of the System: </w:t>
       </w:r>
       <w:r>
         <w:t>Develop a high-speed, secure, offline Intelligent Document Analysis and Learning Assistant System using local RAG.</w:t>
@@ -251,58 +189,10 @@
         <w:rPr>
           <w:b/>
         </w:rPr>
-        <w:t xml:space="preserve">Objective 1: </w:t>
+        <w:t xml:space="preserve">Objectives: </w:t>
       </w:r>
       <w:r>
-        <w:t>Support multi-format text ingestion (PDF, DOCX, TXT, CSV) with page/row tracking.</w:t>
-      </w:r>
-    </w:p>
-    <w:p>
-      <w:pPr>
-        <w:pStyle w:val="ListBullet"/>
-        <w:spacing w:before="0" w:after="60"/>
-        <w:ind w:left="432"/>
-      </w:pPr>
-      <w:r>
-        <w:rPr>
-          <w:b/>
-        </w:rPr>
-        <w:t xml:space="preserve">Objective 2: </w:t>
-      </w:r>
-      <w:r>
-        <w:t>Provide context-grounded question answering using Ollama local models (Qwen 2.5 / Gemma 2).</w:t>
-      </w:r>
-    </w:p>
-    <w:p>
-      <w:pPr>
-        <w:pStyle w:val="ListBullet"/>
-        <w:spacing w:before="0" w:after="60"/>
-        <w:ind w:left="432"/>
-      </w:pPr>
-      <w:r>
-        <w:rPr>
-          <w:b/>
-        </w:rPr>
-        <w:t xml:space="preserve">Objective 3: </w:t>
-      </w:r>
-      <w:r>
-        <w:t>Generate structured summaries, multiple-choice quizzes, and interactive study flashcards offline.</w:t>
-      </w:r>
-    </w:p>
-    <w:p>
-      <w:pPr>
-        <w:pStyle w:val="ListBullet"/>
-        <w:spacing w:before="0" w:after="60"/>
-        <w:ind w:left="432"/>
-      </w:pPr>
-      <w:r>
-        <w:rPr>
-          <w:b/>
-        </w:rPr>
-        <w:t xml:space="preserve">Objective 4: </w:t>
-      </w:r>
-      <w:r>
-        <w:t>Enforce a 0.40 similarity threshold to block out-of-scope hallucinations and support Hausa cross-lingual QA.</w:t>
+        <w:t>1. Support PDF, DOCX, TXT, CSV; 2. Local QA via Ollama (Qwen/Gemma); 3. Offline Summaries, Quizzes &amp; Flashcards; 4. Out-of-Scope Shield &amp; Hausa Support.</w:t>
       </w:r>
     </w:p>
     <w:p>
@@ -316,7 +206,7 @@
           <w:color w:val="1F4E78"/>
           <w:sz w:val="26"/>
         </w:rPr>
-        <w:t>Slide 4: System Development Life Cycle (SDLC) &amp; Methodology</w:t>
+        <w:t>Slide 3: Literature Review (Theoretical Framework, RAG Paradigm &amp; Research Gap)</w:t>
       </w:r>
     </w:p>
     <w:p>
@@ -329,10 +219,10 @@
         <w:rPr>
           <w:b/>
         </w:rPr>
-        <w:t xml:space="preserve">What is the Methodology? </w:t>
+        <w:t xml:space="preserve">Theoretical Framework: </w:t>
       </w:r>
       <w:r>
-        <w:t>Prototyping SDLC — an iterative 4-phase software engineering model chosen over rigid Waterfall for continuous experimental refinement.</w:t>
+        <w:t>Retrieval-Augmented Generation (RAG) combines dense vector search with local generative models to eliminate AI hallucinations.</w:t>
       </w:r>
     </w:p>
     <w:p>
@@ -345,10 +235,10 @@
         <w:rPr>
           <w:b/>
         </w:rPr>
-        <w:t xml:space="preserve">Phase 1 - Requirements &amp; Analysis: </w:t>
+        <w:t xml:space="preserve">RAG Paradigm: </w:t>
       </w:r>
       <w:r>
-        <w:t>Defined offline data privacy requirements, multi-format ingestion needs (PDF, DOCX, CSV), and local CPU hardware latency constraints.</w:t>
+        <w:t>paraphrase-multilingual-MiniLM-L12-v2 generates 384-dim embeddings; FAISS FlatIP index enables instant cosine similarity retrieval.</w:t>
       </w:r>
     </w:p>
     <w:p>
@@ -361,10 +251,10 @@
         <w:rPr>
           <w:b/>
         </w:rPr>
-        <w:t xml:space="preserve">Phase 2 - Quick Prototype Design: </w:t>
+        <w:t xml:space="preserve">Multilingual Foundation: </w:t>
       </w:r>
       <w:r>
-        <w:t>Built initial Next.js single-page UI, FastAPI backend services, SQLite database schemas, and FAISS vector indexing.</w:t>
+        <w:t>Native cross-lingual vector alignment allows querying English documents in Hausa, Arabic, French, Spanish, and German.</w:t>
       </w:r>
     </w:p>
     <w:p>
@@ -377,26 +267,10 @@
         <w:rPr>
           <w:b/>
         </w:rPr>
-        <w:t xml:space="preserve">Phase 3 - Iterative Refinement &amp; Benchmarking: </w:t>
+        <w:t xml:space="preserve">Research Gap: </w:t>
       </w:r>
       <w:r>
-        <w:t>Iteratively benchmarked chunk sizes (finding 1000 chars + 150 overlap optimal) and created the 0.00s deterministic query classifier.</w:t>
-      </w:r>
-    </w:p>
-    <w:p>
-      <w:pPr>
-        <w:pStyle w:val="ListBullet"/>
-        <w:spacing w:before="0" w:after="60"/>
-        <w:ind w:left="432"/>
-      </w:pPr>
-      <w:r>
-        <w:rPr>
-          <w:b/>
-        </w:rPr>
-        <w:t xml:space="preserve">Phase 4 - Final System Evaluation &amp; Testing: </w:t>
-      </w:r>
-      <w:r>
-        <w:t>Validated out-of-scope grounding shield accuracy (threshold 0.40), Hausa query detection, and full offline execution.</w:t>
+        <w:t>Bridging the gap between cloud-dependent LLMs and zero-cost, resource-constrained CPU offline hardware.</w:t>
       </w:r>
     </w:p>
     <w:p>
@@ -410,7 +284,7 @@
           <w:color w:val="1F4E78"/>
           <w:sz w:val="26"/>
         </w:rPr>
-        <w:t>Slide 5: Testing and Benchmark Results</w:t>
+        <w:t>Slide 4: Methodologies (SDLC Rationale, Ingestion Pipeline &amp; Tech Stack)</w:t>
       </w:r>
     </w:p>
     <w:p>
@@ -423,10 +297,10 @@
         <w:rPr>
           <w:b/>
         </w:rPr>
-        <w:t xml:space="preserve">Latency Optimization: </w:t>
+        <w:t xml:space="preserve">Why Prototyping SDLC? </w:t>
       </w:r>
       <w:r>
-        <w:t>Overall RAG execution time on CPU reduced by 48.57% (from 71.69s down to 36.87s).</w:t>
+        <w:t>1. Iterative Chunking (benchmarked 1000-char chunks + 150-char overlap); 2. UI Refinement (collapsible sidebar &amp; study tools); 3. Latency Optimization (0.00s router).</w:t>
       </w:r>
     </w:p>
     <w:p>
@@ -439,10 +313,10 @@
         <w:rPr>
           <w:b/>
         </w:rPr>
-        <w:t xml:space="preserve">Classifier Speedup: </w:t>
+        <w:t xml:space="preserve">Ingestion &amp; Extraction: </w:t>
       </w:r>
       <w:r>
-        <w:t>Deterministic query router reduced intent classification latency from 12.4s down to 0.00s.</w:t>
+        <w:t>Multi-format text extraction (PDF, DOCX, TXT, CSV) mapped to exact page/row metadata for citation tracking.</w:t>
       </w:r>
     </w:p>
     <w:p>
@@ -455,10 +329,10 @@
         <w:rPr>
           <w:b/>
         </w:rPr>
-        <w:t xml:space="preserve">Grounding Shield Accuracy: </w:t>
+        <w:t xml:space="preserve">Deterministic Classifier: </w:t>
       </w:r>
       <w:r>
-        <w:t>0.40 cosine similarity threshold effectively blocked 100% of out-of-scope hallucinated queries.</w:t>
+        <w:t>Rule-based query router bypasses slow LLM classification calls, executing intent routing in 0.00 seconds.</w:t>
       </w:r>
     </w:p>
     <w:p>
@@ -471,10 +345,10 @@
         <w:rPr>
           <w:b/>
         </w:rPr>
-        <w:t xml:space="preserve">System Reliability: </w:t>
+        <w:t xml:space="preserve">Tools &amp; Tech Stack: </w:t>
       </w:r>
       <w:r>
-        <w:t>All primary modules (Auth, Upload, QA, Summary, Quiz, Flashcards) passed automated verification.</w:t>
+        <w:t>Next.js 16 + Tailwind CSS (Frontend), FastAPI + SQLite (Backend), FAISS (Vector Store), Ollama Qwen 2.5/Gemma 2 (Local LLM).</w:t>
       </w:r>
     </w:p>
     <w:p>
@@ -488,7 +362,7 @@
           <w:color w:val="1F4E78"/>
           <w:sz w:val="26"/>
         </w:rPr>
-        <w:t>Slide 6: Conclusion and Contributions</w:t>
+        <w:t>Slide 5: System Design, Implementation &amp; Results</w:t>
       </w:r>
     </w:p>
     <w:p>
@@ -501,10 +375,10 @@
         <w:rPr>
           <w:b/>
         </w:rPr>
-        <w:t xml:space="preserve">Summary: </w:t>
+        <w:t xml:space="preserve">System Architecture: </w:t>
       </w:r>
       <w:r>
-        <w:t>AuraQA successfully proves that high-performance, secure AI document intelligence is achievable locally on CPU hardware.</w:t>
+        <w:t>User → Next.js SPA → FastAPI Server → Sentence Transformers → FAISS Index → Ollama LLM → Grounded Response.</w:t>
       </w:r>
     </w:p>
     <w:p>
@@ -517,10 +391,10 @@
         <w:rPr>
           <w:b/>
         </w:rPr>
-        <w:t xml:space="preserve">Data Sovereignty: </w:t>
+        <w:t xml:space="preserve">Key Feature 1 - Grounded QA &amp; Chat: </w:t>
       </w:r>
       <w:r>
-        <w:t>Eliminates all third-party cloud data transmission, ensuring 100% user data privacy.</w:t>
+        <w:t>Interactive chat with Gemini-style sidebar, streaming responses, and out-of-scope grounding shield (0.40 threshold).</w:t>
       </w:r>
     </w:p>
     <w:p>
@@ -533,10 +407,10 @@
         <w:rPr>
           <w:b/>
         </w:rPr>
-        <w:t xml:space="preserve">Zero Operational Cost: </w:t>
+        <w:t xml:space="preserve">Key Features 2, 3 &amp; 4 - Study Mode &amp; Hausa: </w:t>
       </w:r>
       <w:r>
-        <w:t>Provides educational institutions with unlimited AI assistance at zero API usage fees.</w:t>
+        <w:t>Automated Summary extraction, Multiple-Choice Quiz generator, Study Flashcards, and Hausa (`ha`) cross-lingual QA.</w:t>
       </w:r>
     </w:p>
     <w:p>
@@ -549,10 +423,10 @@
         <w:rPr>
           <w:b/>
         </w:rPr>
-        <w:t xml:space="preserve">Unified Platform: </w:t>
+        <w:t xml:space="preserve">Benchmark Results: </w:t>
       </w:r>
       <w:r>
-        <w:t>First system to integrate multi-lingual document QA, automated summarization, quizzes, and flashcards in one offline application.</w:t>
+        <w:t>Overall RAG CPU latency reduced by 48.57% (71.69s to 36.87s); router latency 0.00s; 100% out-of-scope hallucination block.</w:t>
       </w:r>
     </w:p>
     <w:p>
@@ -566,7 +440,85 @@
           <w:color w:val="1F4E78"/>
           <w:sz w:val="26"/>
         </w:rPr>
-        <w:t>Slide 7: Key References</w:t>
+        <w:t>Slide 6: Summary, Conclusion &amp; Recommendations</w:t>
+      </w:r>
+    </w:p>
+    <w:p>
+      <w:pPr>
+        <w:pStyle w:val="ListBullet"/>
+        <w:spacing w:before="0" w:after="60"/>
+        <w:ind w:left="432"/>
+      </w:pPr>
+      <w:r>
+        <w:rPr>
+          <w:b/>
+        </w:rPr>
+        <w:t xml:space="preserve">Summary of Achievements: </w:t>
+      </w:r>
+      <w:r>
+        <w:t>Built a fully functional, zero-cost, privacy-preserving offline learning assistant operating locally on standard laptop CPUs.</w:t>
+      </w:r>
+    </w:p>
+    <w:p>
+      <w:pPr>
+        <w:pStyle w:val="ListBullet"/>
+        <w:spacing w:before="0" w:after="60"/>
+        <w:ind w:left="432"/>
+      </w:pPr>
+      <w:r>
+        <w:rPr>
+          <w:b/>
+        </w:rPr>
+        <w:t xml:space="preserve">Conclusion: </w:t>
+      </w:r>
+      <w:r>
+        <w:t>Proves that data sovereignty and high-performance AI document analysis are achievable without cloud API dependency.</w:t>
+      </w:r>
+    </w:p>
+    <w:p>
+      <w:pPr>
+        <w:pStyle w:val="ListBullet"/>
+        <w:spacing w:before="0" w:after="60"/>
+        <w:ind w:left="432"/>
+      </w:pPr>
+      <w:r>
+        <w:rPr>
+          <w:b/>
+        </w:rPr>
+        <w:t xml:space="preserve">Recommendations: </w:t>
+      </w:r>
+      <w:r>
+        <w:t>Deploy AuraQA across university libraries, research departments, and schools with limited internet connectivity.</w:t>
+      </w:r>
+    </w:p>
+    <w:p>
+      <w:pPr>
+        <w:pStyle w:val="ListBullet"/>
+        <w:spacing w:before="0" w:after="60"/>
+        <w:ind w:left="432"/>
+      </w:pPr>
+      <w:r>
+        <w:rPr>
+          <w:b/>
+        </w:rPr>
+        <w:t xml:space="preserve">Future Extensions: </w:t>
+      </w:r>
+      <w:r>
+        <w:t>Incorporate OCR for scanned documents, mobile runtime (ONNX), and local Whisper voice assistant interaction.</w:t>
+      </w:r>
+    </w:p>
+    <w:p>
+      <w:pPr>
+        <w:keepNext/>
+        <w:spacing w:before="280" w:after="80"/>
+      </w:pPr>
+      <w:r>
+        <w:rPr>
+          <w:b/>
+          <w:color w:val="1F4E78"/>
+          <w:sz w:val="26"/>
+        </w:rPr>
+        <w:t>Slide 7: References &amp; Defense Conclusion</w:t>
       </w:r>
     </w:p>
     <w:p>
@@ -635,20 +587,6 @@
     </w:p>
     <w:p>
       <w:pPr>
-        <w:keepNext/>
-        <w:spacing w:before="280" w:after="80"/>
-      </w:pPr>
-      <w:r>
-        <w:rPr>
-          <w:b/>
-          <w:color w:val="1F4E78"/>
-          <w:sz w:val="26"/>
-        </w:rPr>
-        <w:t>Slide 8: Recommendations &amp; Future Work</w:t>
-      </w:r>
-    </w:p>
-    <w:p>
-      <w:pPr>
         <w:pStyle w:val="ListBullet"/>
         <w:spacing w:before="0" w:after="60"/>
         <w:ind w:left="432"/>
@@ -657,58 +595,10 @@
         <w:rPr>
           <w:b/>
         </w:rPr>
-        <w:t xml:space="preserve">Recommendation 1: </w:t>
+        <w:t xml:space="preserve">Acknowledgement &amp; Q&amp;A: </w:t>
       </w:r>
       <w:r>
-        <w:t>Incorporate Optical Character Recognition (OCR) for scanned paper documents.</w:t>
-      </w:r>
-    </w:p>
-    <w:p>
-      <w:pPr>
-        <w:pStyle w:val="ListBullet"/>
-        <w:spacing w:before="0" w:after="60"/>
-        <w:ind w:left="432"/>
-      </w:pPr>
-      <w:r>
-        <w:rPr>
-          <w:b/>
-        </w:rPr>
-        <w:t xml:space="preserve">Recommendation 2: </w:t>
-      </w:r>
-      <w:r>
-        <w:t>Develop a lightweight cross-platform mobile application powered by ONNX runtime.</w:t>
-      </w:r>
-    </w:p>
-    <w:p>
-      <w:pPr>
-        <w:pStyle w:val="ListBullet"/>
-        <w:spacing w:before="0" w:after="60"/>
-        <w:ind w:left="432"/>
-      </w:pPr>
-      <w:r>
-        <w:rPr>
-          <w:b/>
-        </w:rPr>
-        <w:t xml:space="preserve">Recommendation 3: </w:t>
-      </w:r>
-      <w:r>
-        <w:t>Integrate local Whisper Speech-to-Text for hands-free voice interaction.</w:t>
-      </w:r>
-    </w:p>
-    <w:p>
-      <w:pPr>
-        <w:pStyle w:val="ListBullet"/>
-        <w:spacing w:before="0" w:after="60"/>
-        <w:ind w:left="432"/>
-      </w:pPr>
-      <w:r>
-        <w:rPr>
-          <w:b/>
-        </w:rPr>
-        <w:t xml:space="preserve">Q&amp;A Session: </w:t>
-      </w:r>
-      <w:r>
-        <w:t>Thank you for your time and attention. Open for questions from the panel.</w:t>
+        <w:t>Heartfelt thanks to FUK, Supervisor Dr. David Oyewola, HOD Dr. (Mrs.) Asabe. Open for panel questions.</w:t>
       </w:r>
     </w:p>
     <w:sectPr>
@@ -1086,7 +976,6 @@
     <w:rsid w:val="00FC693F"/>
     <w:rPr>
       <w:rFonts w:ascii="Times New Roman" w:hAnsi="Times New Roman"/>
-      <w:color w:val="333333"/>
       <w:sz w:val="22"/>
     </w:rPr>
   </w:style>

</xml_diff>